<commit_message>
chore: Remove outdated document and update CV JSON with corrected contact details and company name, ensuring consistency across related files
</commit_message>
<xml_diff>
--- a/Fortil - VARIANTE - RPR - AMOA - 2 ans d'XP.docx
+++ b/Fortil - VARIANTE - RPR - AMOA - 2 ans d'XP.docx
@@ -4,18 +4,10 @@
   <w:body>
     <w:p>
       <w:r>
-        <w:t>DOSSIER DE COMPÉTENCES — Template avec balises cv2doc</w:t>
+        <w:t>DOSSIER DE COMPÉTENCES</w:t>
       </w:r>
     </w:p>
     <w:p/>
-    <w:p>
-      <w:pPr>
-        <w:pStyle w:val="Heading1"/>
-      </w:pPr>
-      <w:r>
-        <w:t>Identité</w:t>
-      </w:r>
-    </w:p>
     <w:p>
       <w:r>
         <w:t>Nom : {{ nom }}</w:t>
@@ -33,132 +25,50 @@
     </w:p>
     <w:p/>
     <w:p>
-      <w:pPr>
-        <w:pStyle w:val="Heading1"/>
-      </w:pPr>
       <w:r>
-        <w:t>Expertises</w:t>
+        <w:t xml:space="preserve">Expertises : </w:t>
       </w:r>
     </w:p>
     <w:p>
       <w:r>
         <w:t>{% for ex in expertises %}</w:t>
-      </w:r>
-    </w:p>
-    <w:p>
-      <w:r>
-        <w:t>{{ ex.titre_expertise }} — Niveau : {{ ex.niveau_expertise }}</w:t>
-      </w:r>
-    </w:p>
-    <w:p>
-      <w:r>
+        <w:br/>
+        <w:t>{{ ex.titre_expertise }} — {{ ex.niveau_expertise }}</w:t>
+        <w:br/>
         <w:t>{{ ex.expertises }}</w:t>
-      </w:r>
-    </w:p>
-    <w:p>
-      <w:r>
+        <w:br/>
         <w:t>{% endfor %}</w:t>
       </w:r>
     </w:p>
     <w:p/>
     <w:p>
-      <w:pPr>
-        <w:pStyle w:val="Heading1"/>
-      </w:pPr>
       <w:r>
-        <w:t>Savoir-être</w:t>
-      </w:r>
-    </w:p>
-    <w:p>
-      <w:r>
-        <w:t>{% for s in savoir_etre %}</w:t>
-      </w:r>
-    </w:p>
-    <w:p>
-      <w:r>
-        <w:t>{{ s.compétence }}</w:t>
-      </w:r>
-    </w:p>
-    <w:p>
-      <w:r>
-        <w:t>{% endfor %}</w:t>
+        <w:t>Savoir-être : {% for s in savoir_etre %}{{ s.compétence }} {% endfor %}</w:t>
       </w:r>
     </w:p>
     <w:p/>
     <w:p>
-      <w:pPr>
-        <w:pStyle w:val="Heading1"/>
-      </w:pPr>
       <w:r>
-        <w:t>Langues</w:t>
-      </w:r>
-    </w:p>
-    <w:p>
-      <w:r>
-        <w:t>{% for l in langues %}</w:t>
-      </w:r>
-    </w:p>
-    <w:p>
-      <w:r>
-        <w:t>{{ l.langue }} : {{ l.niveau }}</w:t>
-      </w:r>
-    </w:p>
-    <w:p>
-      <w:r>
-        <w:t>{% endfor %}</w:t>
+        <w:t>Langues : {% for l in langues %}{{ l.langue }} ({{ l.niveau }}) {% endfor %}</w:t>
       </w:r>
     </w:p>
     <w:p/>
     <w:p>
-      <w:pPr>
-        <w:pStyle w:val="Heading1"/>
-      </w:pPr>
-      <w:r>
-        <w:t>Expériences</w:t>
-      </w:r>
-    </w:p>
-    <w:p>
       <w:r>
         <w:t>{% for exp in expériences %}</w:t>
-      </w:r>
-    </w:p>
-    <w:p>
-      <w:r>
-        <w:t>{{ exp.début }} — {{ exp.fin }}</w:t>
-      </w:r>
-    </w:p>
-    <w:p>
-      <w:r>
-        <w:t>Société : {{ exp.société }} | Secteur : {{ exp.secteur_activité }}</w:t>
-      </w:r>
-    </w:p>
-    <w:p>
-      <w:r>
-        <w:t>Programme : {{ exp.programme }} | Poste : {{ exp.poste }}</w:t>
-      </w:r>
-    </w:p>
-    <w:p>
-      <w:r>
+        <w:br/>
+        <w:t>{{ exp.début }} — {{ exp.fin }} | {{ exp.société }} | {{ exp.poste }}</w:t>
+        <w:br/>
         <w:t>Objectif : {{ exp.objectif }}</w:t>
-      </w:r>
-    </w:p>
-    <w:p>
-      <w:r>
+        <w:br/>
         <w:t>Activités : {{ exp.activités }}</w:t>
-      </w:r>
-    </w:p>
-    <w:p>
-      <w:r>
-        <w:t>Environnement technique : {{ exp.environnement_technique }}</w:t>
-      </w:r>
-    </w:p>
-    <w:p>
-      <w:r>
+        <w:br/>
+        <w:t>Environnement : {{ exp.environnement_technique }}</w:t>
+        <w:br/>
         <w:t>Expertises mobilisées : {{ exp.expertise_mobilisées }}</w:t>
-      </w:r>
-    </w:p>
-    <w:p>
-      <w:r>
+        <w:br/>
+        <w:t>---</w:t>
+        <w:br/>
         <w:t>{% endfor %}</w:t>
       </w:r>
     </w:p>

</xml_diff>